<commit_message>
Update closing-request approval report with commit hash
Co-authored-by: Sonic-Media <Sonic-Media@users.noreply.github.com>
</commit_message>
<xml_diff>
--- a/docs/data-integrity/CLOSING-REQUEST-APPROVAL-FLOW.docx
+++ b/docs/data-integrity/CLOSING-REQUEST-APPROVAL-FLOW.docx
@@ -13,6 +13,11 @@
     <w:p>
       <w:r>
         <w:t>**Branch:** `cursor/close-shop-ux-fix-b6e7`</w:t>
+      </w:r>
+    </w:p>
+    <w:p>
+      <w:r>
+        <w:t>**Commit:** `788aeac`</w:t>
       </w:r>
     </w:p>
     <w:p>

</xml_diff>

<commit_message>
Record Vercel Preview PASS in closing-request approval report
Co-authored-by: Sonic-Media <Sonic-Media@users.noreply.github.com>
</commit_message>
<xml_diff>
--- a/docs/data-integrity/CLOSING-REQUEST-APPROVAL-FLOW.docx
+++ b/docs/data-integrity/CLOSING-REQUEST-APPROVAL-FLOW.docx
@@ -17,7 +17,7 @@
     </w:p>
     <w:p>
       <w:r>
-        <w:t>**Commit:** `788aeac`</w:t>
+        <w:t>**Commit:** `6f44b76` (feature: `788aeac`)</w:t>
       </w:r>
     </w:p>
     <w:p>
@@ -854,7 +854,7 @@
         <w:pStyle w:val="IntenseQuote"/>
       </w:pPr>
       <w:r>
-        <w:t>| Vercel Preview rebuild | Expected on push |</w:t>
+        <w:t>| Vercel Preview rebuild | **PASS** (CI green on push) |</w:t>
       </w:r>
     </w:p>
     <w:p>

</xml_diff>